<commit_message>
Implement user management, password reset, and permissions system with migrations v8-v11
</commit_message>
<xml_diff>
--- a/แนวคิดโมเดล.docx
+++ b/แนวคิดโมเดล.docx
@@ -41,11 +41,7 @@
         </w:rPr>
         <w:t xml:space="preserve">VV Matrix (Value, </w:t>
       </w:r>
-    </w:p>
-    <w:p>
-      <w:pPr>
-        <w:spacing w:before="100" w:beforeAutospacing="1" w:after="100" w:afterAutospacing="1" w:line="240" w:lineRule="auto"/>
-        <w:outlineLvl w:val="0"/>
+      <w:r>
         <w:rPr>
           <w:rFonts w:ascii="TH Sarabun New" w:eastAsia="Times New Roman" w:hAnsi="TH Sarabun New" w:cs="TH Sarabun New"/>
           <w:b/>
@@ -55,18 +51,7 @@
           <w:szCs w:val="36"/>
           <w14:ligatures w14:val="none"/>
         </w:rPr>
-      </w:pPr>
-      <w:r>
-        <w:rPr>
-          <w:rFonts w:ascii="TH Sarabun New" w:eastAsia="Times New Roman" w:hAnsi="TH Sarabun New" w:cs="TH Sarabun New"/>
-          <w:b/>
-          <w:bCs/>
-          <w:kern w:val="36"/>
-          <w:sz w:val="36"/>
-          <w:szCs w:val="36"/>
-          <w14:ligatures w14:val="none"/>
-        </w:rPr>
-        <w:t>Value × Shelf Life Scoring Matrix</w:t>
+        <w:t>Validity Matrix)</w:t>
       </w:r>
     </w:p>
     <w:p>
@@ -439,14 +424,15 @@
       </w:pPr>
       <w:r>
         <w:rPr>
-          <w:rFonts w:ascii="TH Sarabun New" w:eastAsia="Times New Roman" w:hAnsi="TH Sarabun New" w:cs="TH Sarabun New"/>
           <w:noProof/>
-          <w:kern w:val="0"/>
-          <w:sz w:val="36"/>
-          <w:szCs w:val="36"/>
-        </w:rPr>
-        <w:pict w14:anchorId="4E698E07">
-          <v:rect id="_x0000_i1029" alt="" style="width:468pt;height:.05pt;mso-width-percent:0;mso-height-percent:0;mso-width-percent:0;mso-height-percent:0" o:hralign="center" o:hrstd="t" o:hr="t" fillcolor="#a0a0a0" stroked="f"/>
+        </w:rPr>
+      </w:r>
+      <w:r>
+        <w:pict w14:anchorId="173F37FA">
+          <v:rect id="Horizontal Line 1" o:spid="_x0000_s1030" style="width:468pt;height:.05pt;visibility:visible;mso-wrap-style:square;mso-left-percent:-10001;mso-top-percent:-10001;mso-position-horizontal:absolute;mso-position-horizontal-relative:char;mso-position-vertical:absolute;mso-position-vertical-relative:line;mso-left-percent:-10001;mso-top-percent:-10001;v-text-anchor:top" o:gfxdata="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" filled="f">
+            <o:lock v:ext="edit" rotation="t" aspectratio="t" verticies="t" text="t" shapetype="t"/>
+            <w10:anchorlock/>
+          </v:rect>
         </w:pict>
       </w:r>
     </w:p>
@@ -514,19 +500,7 @@
           <w:szCs w:val="36"/>
           <w14:ligatures w14:val="none"/>
         </w:rPr>
-        <w:t>1.</w:t>
-      </w:r>
-      <w:r>
-        <w:rPr>
-          <w:rFonts w:ascii="TH Sarabun New" w:eastAsia="Times New Roman" w:hAnsi="TH Sarabun New" w:cs="TH Sarabun New"/>
-          <w:b/>
-          <w:bCs/>
-          <w:kern w:val="0"/>
-          <w:sz w:val="36"/>
-          <w:szCs w:val="36"/>
-          <w14:ligatures w14:val="none"/>
-        </w:rPr>
-        <w:t>Value Score (0–5)</w:t>
+        <w:t>1.Value Score (0–5)</w:t>
       </w:r>
     </w:p>
     <w:p>
@@ -1030,15 +1004,15 @@
       </w:pPr>
       <w:r>
         <w:rPr>
-          <w:rFonts w:ascii="TH Sarabun New" w:eastAsia="Times New Roman" w:hAnsi="TH Sarabun New" w:cs="TH Sarabun New"/>
           <w:noProof/>
-          <w:kern w:val="0"/>
-          <w:sz w:val="36"/>
-          <w:szCs w:val="36"/>
-        </w:rPr>
-        <w:lastRenderedPageBreak/>
-        <w:pict w14:anchorId="67869A63">
-          <v:rect id="_x0000_i1028" alt="" style="width:468pt;height:.05pt;mso-width-percent:0;mso-height-percent:0;mso-width-percent:0;mso-height-percent:0" o:hralign="center" o:hrstd="t" o:hr="t" fillcolor="#a0a0a0" stroked="f"/>
+        </w:rPr>
+      </w:r>
+      <w:r>
+        <w:pict w14:anchorId="375D4CBE">
+          <v:rect id="Horizontal Line 2" o:spid="_x0000_s1029" style="width:468pt;height:.05pt;visibility:visible;mso-wrap-style:square;mso-left-percent:-10001;mso-top-percent:-10001;mso-position-horizontal:absolute;mso-position-horizontal-relative:char;mso-position-vertical:absolute;mso-position-vertical-relative:line;mso-left-percent:-10001;mso-top-percent:-10001;v-text-anchor:top" o:gfxdata="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" filled="f">
+            <o:lock v:ext="edit" rotation="t" aspectratio="t" verticies="t" text="t" shapetype="t"/>
+            <w10:anchorlock/>
+          </v:rect>
         </w:pict>
       </w:r>
     </w:p>
@@ -1081,19 +1055,7 @@
           <w:szCs w:val="36"/>
           <w14:ligatures w14:val="none"/>
         </w:rPr>
-        <w:t>2.</w:t>
-      </w:r>
-      <w:r>
-        <w:rPr>
-          <w:rFonts w:ascii="TH Sarabun New" w:eastAsia="Times New Roman" w:hAnsi="TH Sarabun New" w:cs="TH Sarabun New"/>
-          <w:b/>
-          <w:bCs/>
-          <w:kern w:val="0"/>
-          <w:sz w:val="36"/>
-          <w:szCs w:val="36"/>
-          <w14:ligatures w14:val="none"/>
-        </w:rPr>
-        <w:t>Shelf Life Score (0–5)</w:t>
+        <w:t>2.Shelf Life Score (0–5)</w:t>
       </w:r>
     </w:p>
     <w:p>
@@ -1203,6 +1165,9 @@
             </m:den>
           </m:f>
           <m:r>
+            <m:rPr>
+              <m:sty m:val="p"/>
+            </m:rPr>
             <w:rPr>
               <w:rFonts w:ascii="TH Sarabun New" w:eastAsia="Times New Roman" w:hAnsi="TH Sarabun New" w:cs="TH Sarabun New"/>
               <w:kern w:val="0"/>
@@ -1634,14 +1599,15 @@
       </w:pPr>
       <w:r>
         <w:rPr>
-          <w:rFonts w:ascii="TH Sarabun New" w:eastAsia="Times New Roman" w:hAnsi="TH Sarabun New" w:cs="TH Sarabun New"/>
           <w:noProof/>
-          <w:kern w:val="0"/>
-          <w:sz w:val="36"/>
-          <w:szCs w:val="36"/>
-        </w:rPr>
-        <w:pict w14:anchorId="56C455F4">
-          <v:rect id="_x0000_i1027" style="width:0;height:1.5pt" o:hralign="center" o:hrstd="t" o:hr="t" fillcolor="#a0a0a0" stroked="f"/>
+        </w:rPr>
+      </w:r>
+      <w:r>
+        <w:pict w14:anchorId="209BA581">
+          <v:rect id="Horizontal Line 3" o:spid="_x0000_s1028" style="width:468pt;height:1.1pt;visibility:visible;mso-wrap-style:square;mso-left-percent:-10001;mso-top-percent:-10001;mso-position-horizontal:absolute;mso-position-horizontal-relative:char;mso-position-vertical:absolute;mso-position-vertical-relative:line;mso-left-percent:-10001;mso-top-percent:-10001;v-text-anchor:top" o:gfxdata="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" filled="f">
+            <o:lock v:ext="edit" rotation="t" aspectratio="t" verticies="t" text="t" shapetype="t"/>
+            <w10:anchorlock/>
+          </v:rect>
         </w:pict>
       </w:r>
     </w:p>
@@ -1746,6 +1712,9 @@
             </m:den>
           </m:f>
           <m:r>
+            <m:rPr>
+              <m:sty m:val="p"/>
+            </m:rPr>
             <w:rPr>
               <w:rFonts w:ascii="TH Sarabun New" w:eastAsia="Times New Roman" w:hAnsi="TH Sarabun New" w:cs="TH Sarabun New"/>
               <w:kern w:val="0"/>
@@ -1816,14 +1785,15 @@
       </w:pPr>
       <w:r>
         <w:rPr>
-          <w:rFonts w:ascii="TH Sarabun New" w:eastAsia="Times New Roman" w:hAnsi="TH Sarabun New" w:cs="TH Sarabun New"/>
           <w:noProof/>
-          <w:kern w:val="0"/>
-          <w:sz w:val="36"/>
-          <w:szCs w:val="36"/>
-        </w:rPr>
-        <w:pict w14:anchorId="5C708BD1">
-          <v:rect id="_x0000_i1026" alt="" style="width:468pt;height:.05pt;mso-width-percent:0;mso-height-percent:0;mso-width-percent:0;mso-height-percent:0" o:hralign="center" o:hrstd="t" o:hr="t" fillcolor="#a0a0a0" stroked="f"/>
+        </w:rPr>
+      </w:r>
+      <w:r>
+        <w:pict w14:anchorId="3F7B705D">
+          <v:rect id="Horizontal Line 4" o:spid="_x0000_s1027" style="width:468pt;height:.05pt;visibility:visible;mso-wrap-style:square;mso-left-percent:-10001;mso-top-percent:-10001;mso-position-horizontal:absolute;mso-position-horizontal-relative:char;mso-position-vertical:absolute;mso-position-vertical-relative:line;mso-left-percent:-10001;mso-top-percent:-10001;v-text-anchor:top" o:gfxdata="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" filled="f">
+            <o:lock v:ext="edit" rotation="t" aspectratio="t" verticies="t" text="t" shapetype="t"/>
+            <w10:anchorlock/>
+          </v:rect>
         </w:pict>
       </w:r>
     </w:p>
@@ -1866,7 +1836,6 @@
           <w:szCs w:val="36"/>
           <w14:ligatures w14:val="none"/>
         </w:rPr>
-        <w:lastRenderedPageBreak/>
         <w:t xml:space="preserve">Interpretation </w:t>
       </w:r>
     </w:p>
@@ -1922,6 +1891,7 @@
                 <w:szCs w:val="36"/>
                 <w14:ligatures w14:val="none"/>
               </w:rPr>
+              <w:lastRenderedPageBreak/>
               <w:t>Final Score</w:t>
             </w:r>
           </w:p>
@@ -2165,7 +2135,7 @@
                 <w:szCs w:val="36"/>
                 <w14:ligatures w14:val="none"/>
               </w:rPr>
-              <w:t xml:space="preserve"> Core Product</w:t>
+              <w:t>Core Product</w:t>
             </w:r>
           </w:p>
         </w:tc>
@@ -2519,14 +2489,15 @@
       </w:pPr>
       <w:r>
         <w:rPr>
-          <w:rFonts w:ascii="TH Sarabun New" w:eastAsia="Times New Roman" w:hAnsi="TH Sarabun New" w:cs="TH Sarabun New"/>
           <w:noProof/>
-          <w:kern w:val="0"/>
-          <w:sz w:val="36"/>
-          <w:szCs w:val="36"/>
-        </w:rPr>
-        <w:pict w14:anchorId="282B9019">
-          <v:rect id="_x0000_i1025" style="width:0;height:1.5pt" o:hralign="center" o:hrstd="t" o:hr="t" fillcolor="#a0a0a0" stroked="f"/>
+        </w:rPr>
+      </w:r>
+      <w:r>
+        <w:pict w14:anchorId="39219542">
+          <v:rect id="Horizontal Line 5" o:spid="_x0000_s1026" style="width:468pt;height:1.1pt;visibility:visible;mso-wrap-style:square;mso-left-percent:-10001;mso-top-percent:-10001;mso-position-horizontal:absolute;mso-position-horizontal-relative:char;mso-position-vertical:absolute;mso-position-vertical-relative:line;mso-left-percent:-10001;mso-top-percent:-10001;v-text-anchor:top" o:gfxdata="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" filled="f">
+            <o:lock v:ext="edit" rotation="t" aspectratio="t" verticies="t" text="t" shapetype="t"/>
+            <w10:anchorlock/>
+          </v:rect>
         </w:pict>
       </w:r>
     </w:p>
@@ -2604,8 +2575,8 @@
       </w:tblPr>
       <w:tblGrid>
         <w:gridCol w:w="1019"/>
-        <w:gridCol w:w="2400"/>
-        <w:gridCol w:w="2258"/>
+        <w:gridCol w:w="1963"/>
+        <w:gridCol w:w="1820"/>
       </w:tblGrid>
       <w:tr>
         <w:trPr>
@@ -2789,26 +2760,6 @@
             </w:pPr>
             <w:r>
               <w:rPr>
-                <w:rFonts w:ascii="Apple Color Emoji" w:eastAsia="Times New Roman" w:hAnsi="Apple Color Emoji" w:cs="Apple Color Emoji"/>
-                <w:kern w:val="0"/>
-                <w:sz w:val="36"/>
-                <w:szCs w:val="36"/>
-                <w14:ligatures w14:val="none"/>
-              </w:rPr>
-              <w:t>⭐</w:t>
-            </w:r>
-            <w:r>
-              <w:rPr>
-                <w:rFonts w:ascii="TH Sarabun New" w:eastAsia="Times New Roman" w:hAnsi="TH Sarabun New" w:cs="TH Sarabun New"/>
-                <w:kern w:val="0"/>
-                <w:sz w:val="36"/>
-                <w:szCs w:val="36"/>
-                <w14:ligatures w14:val="none"/>
-              </w:rPr>
-              <w:t xml:space="preserve"> </w:t>
-            </w:r>
-            <w:r>
-              <w:rPr>
                 <w:rFonts w:ascii="TH Sarabun New" w:eastAsia="Times New Roman" w:hAnsi="TH Sarabun New" w:cs="TH Sarabun New"/>
                 <w:b/>
                 <w:bCs/>
@@ -2838,26 +2789,6 @@
                 <w14:ligatures w14:val="none"/>
               </w:rPr>
             </w:pPr>
-            <w:r>
-              <w:rPr>
-                <w:rFonts w:ascii="Apple Color Emoji" w:eastAsia="Times New Roman" w:hAnsi="Apple Color Emoji" w:cs="Apple Color Emoji"/>
-                <w:kern w:val="0"/>
-                <w:sz w:val="36"/>
-                <w:szCs w:val="36"/>
-                <w14:ligatures w14:val="none"/>
-              </w:rPr>
-              <w:t>⚠️</w:t>
-            </w:r>
-            <w:r>
-              <w:rPr>
-                <w:rFonts w:ascii="TH Sarabun New" w:eastAsia="Times New Roman" w:hAnsi="TH Sarabun New" w:cs="TH Sarabun New"/>
-                <w:kern w:val="0"/>
-                <w:sz w:val="36"/>
-                <w:szCs w:val="36"/>
-                <w14:ligatures w14:val="none"/>
-              </w:rPr>
-              <w:t xml:space="preserve"> </w:t>
-            </w:r>
             <w:r>
               <w:rPr>
                 <w:rFonts w:ascii="TH Sarabun New" w:eastAsia="Times New Roman" w:hAnsi="TH Sarabun New" w:cs="TH Sarabun New"/>
@@ -2936,26 +2867,6 @@
             </w:pPr>
             <w:r>
               <w:rPr>
-                <w:rFonts w:ascii="Apple Color Emoji" w:eastAsia="Times New Roman" w:hAnsi="Apple Color Emoji" w:cs="Apple Color Emoji"/>
-                <w:kern w:val="0"/>
-                <w:sz w:val="36"/>
-                <w:szCs w:val="36"/>
-                <w14:ligatures w14:val="none"/>
-              </w:rPr>
-              <w:t>💡</w:t>
-            </w:r>
-            <w:r>
-              <w:rPr>
-                <w:rFonts w:ascii="TH Sarabun New" w:eastAsia="Times New Roman" w:hAnsi="TH Sarabun New" w:cs="TH Sarabun New"/>
-                <w:kern w:val="0"/>
-                <w:sz w:val="36"/>
-                <w:szCs w:val="36"/>
-                <w14:ligatures w14:val="none"/>
-              </w:rPr>
-              <w:t xml:space="preserve"> </w:t>
-            </w:r>
-            <w:r>
-              <w:rPr>
                 <w:rFonts w:ascii="TH Sarabun New" w:eastAsia="Times New Roman" w:hAnsi="TH Sarabun New" w:cs="TH Sarabun New"/>
                 <w:b/>
                 <w:bCs/>
@@ -2985,26 +2896,6 @@
                 <w14:ligatures w14:val="none"/>
               </w:rPr>
             </w:pPr>
-            <w:r>
-              <w:rPr>
-                <w:rFonts w:ascii="Apple Color Emoji" w:eastAsia="Times New Roman" w:hAnsi="Apple Color Emoji" w:cs="Apple Color Emoji"/>
-                <w:kern w:val="0"/>
-                <w:sz w:val="36"/>
-                <w:szCs w:val="36"/>
-                <w14:ligatures w14:val="none"/>
-              </w:rPr>
-              <w:t>❌</w:t>
-            </w:r>
-            <w:r>
-              <w:rPr>
-                <w:rFonts w:ascii="TH Sarabun New" w:eastAsia="Times New Roman" w:hAnsi="TH Sarabun New" w:cs="TH Sarabun New"/>
-                <w:kern w:val="0"/>
-                <w:sz w:val="36"/>
-                <w:szCs w:val="36"/>
-                <w14:ligatures w14:val="none"/>
-              </w:rPr>
-              <w:t xml:space="preserve"> </w:t>
-            </w:r>
             <w:r>
               <w:rPr>
                 <w:rFonts w:ascii="TH Sarabun New" w:eastAsia="Times New Roman" w:hAnsi="TH Sarabun New" w:cs="TH Sarabun New"/>

</xml_diff>